<commit_message>
PV : modele corrige sans « /Regionale » (titre + phrase d'avis)
Retrait de « /REGIONALE » (titre) et « /Regionale » (phrase d'avis) du
modele PV_AFSR_PPMAGPM_CENTRALE.docx, au niveau des 2 runs isoles
concernes (pas de recreation) : mise en forme et embleme HD preserves.
- Titre  -> « PROCES-VERBAL DE LA COMMISSION CENTRALE... »
- Avis   -> « La Commission Centrale des Marches emet un AVIS FAVORABLE... »

Le reste de la generation du Projet de PV (secretaire de seance, formats
de date, presents filtre, ANNEXE, FSX, endpoint) etait deja en place.

- Tests : document_pv_titre_sans_regionale, document_pv_avis_sans_regionale.

Co-Authored-By: Claude Opus 4.8 (1M context) <noreply@anthropic.com>
</commit_message>
<xml_diff>
--- a/src/main/resources/templates/PV_AFSR_PPMAGPM_CENTRALE.docx
+++ b/src/main/resources/templates/PV_AFSR_PPMAGPM_CENTRALE.docx
@@ -363,7 +363,7 @@
           <w:spacing w:val="-2"/>
           <w:u w:val="single"/>
         </w:rPr>
-        <w:t>CENTRALE/REGIONALE…</w:t>
+        <w:t>CENTRALE…</w:t>
       </w:r>
     </w:p>
     <w:p>
@@ -1586,7 +1586,7 @@
         <w:rPr>
           <w:sz w:val="20"/>
         </w:rPr>
-        <w:t>Centrale/Régionale</w:t>
+        <w:t>Centrale</w:t>
       </w:r>
       <w:r>
         <w:rPr>

</xml_diff>